<commit_message>
fix(rules): stop TY-02 false positives on file names, colons in words and bibliography
Co-Authored-By: Claude Opus 5.5 <noreply@anthropic.com>
</commit_message>
<xml_diff>
--- a/fixtures/TY-02/bad.docx
+++ b/fixtures/TY-02/bad.docx
@@ -5,6 +5,11 @@
     <w:p>
       <w:r>
         <w:t xml:space="preserve">Пробел перед запятой , и без пробела после,так нельзя.</w:t>
+      </w:r>
+    </w:p>
+    <w:p>
+      <w:r>
+        <w:t xml:space="preserve">Пробел перед точкой в конце предложения .</w:t>
       </w:r>
     </w:p>
     <w:sectPr>

</xml_diff>